<commit_message>
ai output debug test 1
</commit_message>
<xml_diff>
--- a/uploads/231cjddy/231cjddy_成绩信息汇总.docx
+++ b/uploads/231cjddy/231cjddy_成绩信息汇总.docx
@@ -13,18 +13,6 @@
           <w:sz w:val="36"/>
         </w:rPr>
         <w:t>课程反思报告</w:t>
-      </w:r>
-    </w:p>
-    <w:p>
-      <w:pPr>
-        <w:jc w:val="center"/>
-      </w:pPr>
-      <w:r>
-        <w:rPr>
-          <w:rFonts w:ascii="Times New Roman" w:hAnsi="Times New Roman"/>
-          <w:sz w:val="21"/>
-        </w:rPr>
-        <w:t>(2023-2024学年第1学期)</w:t>
       </w:r>
     </w:p>
     <w:p>
@@ -73,7 +61,7 @@
           <w:rFonts w:ascii="SimSun" w:hAnsi="SimSun" w:eastAsia="SimSun"/>
           <w:sz w:val="21"/>
         </w:rPr>
-        <w:t>授课对象及合班情况：1，共计47人</w:t>
+        <w:t>授课对象及合班情况：g和d，共计47人</w:t>
       </w:r>
     </w:p>
     <w:p>
@@ -433,7 +421,7 @@
           <w:rFonts w:ascii="SimSun" w:hAnsi="SimSun" w:eastAsia="SimSun"/>
           <w:sz w:val="21"/>
         </w:rPr>
-        <w:t>1班的网络学习部分的成绩情况见表2。</w:t>
+        <w:t>g和d班的网络学习部分的成绩情况见表2。</w:t>
       </w:r>
     </w:p>
     <w:p>
@@ -1268,19 +1256,38 @@
           <w:rFonts w:ascii="SimSun" w:hAnsi="SimSun" w:eastAsia="SimSun"/>
           <w:sz w:val="21"/>
         </w:rPr>
-        <w:t>本课程共有47名学生参与。整体来看，学生的表现呈现出一定的两极分化趋势，但大多数学生取得了较好的成绩。</w:t>
+        <w:t>本报告旨在对本学期所授课程的学生表现进行深入分析。通过对学生得分数据的细致分析，旨在识别课程教学中的优势与不足，并据此提出改进建议。</w:t>
         <w:br/>
         <w:br/>
-        <w:t>最高分达到了99.4分，而最低分为0分。平均分为77.73分，表明大部分学生能够掌握课程的核心内容。然而，有4名学生未能通过课程，占比约8.51%，这提示我们可能需要关注这部分学生的学习状况，提供更多的支持与辅导。</w:t>
+        <w:t>**一、总体情况**</w:t>
         <w:br/>
         <w:br/>
-        <w:t>从成绩分布来看，超过半数的学生（61.70%）获得了90分以上的高分，这表明大部分学生对课程内容掌握得较好，能够灵活运用所学知识。而0-10分这个区间内有4名学生，占比8.51%，这部分学生可能需要额外的关注和支持来提升他们的学习效果。</w:t>
+        <w:t>本次课程共47名学生参与。学生得分范围从0至99.4分，平均分为77.73分。该平均分表明多数学生能够较好地掌握课程内容，但也有部分学生在学习过程中遇到了较大困难。</w:t>
         <w:br/>
         <w:br/>
-        <w:t>中间分数段（20-80分）的学生人数较少，仅占10.64%。其中，40-50分、50-60分、60-70分以及70-80分这几个区间内的人数分别为2人、3人、3人和1人，这些学生虽然总体表现良好，但在某些方面可能还需要进一步提高。</w:t>
+        <w:t>**二、成绩分布分析**</w:t>
         <w:br/>
         <w:br/>
-        <w:t>总体而言，大部分学生表现优异，但仍需关注少数低分学生的学习情况，以便更好地帮助他们提高成绩。未来可以考虑增加针对不同层次学生的个性化辅导和教学方法，以确保每位学生都能获得充分的发展机会。</w:t>
+        <w:t>- **高分段学生比例显著**：获得90-100分的学生占总人数的61.70%，表明大部分学生能够很好地理解并应用课程知识，达到预期的教学目标。</w:t>
+        <w:br/>
+        <w:t>- **低分段学生关注**：0-10分区间内有4名学生，占比8.51%，说明这部分学生在学习过程中存在较为明显的障碍，需要特别关注其学习过程中的具体困难，以便采取针对性措施提供帮助。</w:t>
+        <w:br/>
+        <w:t>- **中间分数段学生情况**：40-50分、50-60分及60-70分区间的学生人数较少，分别占总人数的4.26%、6.38%及6.38%。这一现象提示可能存在教学内容难度设置不合理或部分学生学习方法不当的问题。</w:t>
+        <w:br/>
+        <w:br/>
+        <w:t>**三、成绩分析结论与建议**</w:t>
+        <w:br/>
+        <w:br/>
+        <w:t>1. **加强基础概念讲解**：鉴于低分段学生较多，建议在今后的教学中加强对基础概念的详细解释和反复练习，确保所有学生都能打下坚实的基础。</w:t>
+        <w:br/>
+        <w:t>2. **个性化辅导**：针对不同水平的学生提供个性化指导，如建立学习小组或安排额外辅导时间，帮助成绩较低的学生克服学习障碍。</w:t>
+        <w:br/>
+        <w:t>3. **增加互动环节**：提高课堂互动性，鼓励学生提问和讨论，促进知识的理解和记忆。对于成绩较好的学生，可以适当引入更高阶的学习材料或挑战性任务，激发他们的学习兴趣。</w:t>
+        <w:br/>
+        <w:t>4. **定期反馈与调整**：建立定期反馈机制，及时了解学生的学习进度和遇到的难题，并据此调整教学策略，以更好地适应学生的需求。</w:t>
+        <w:br/>
+        <w:br/>
+        <w:t>通过上述分析与建议，期望能进一步提升教学质量，确保每位学生都能充分受益于本课程的学习经历。</w:t>
       </w:r>
     </w:p>
     <w:p>
@@ -1307,7 +1314,7 @@
         </w:rPr>
         <w:t>本学期共进行了XX次实验，全部在万维考试系统上完成，由系统自动评分。</w:t>
         <w:br/>
-        <w:t>1班的实验成绩情况见表3。</w:t>
+        <w:t>g和d班的实验成绩情况见表3。</w:t>
       </w:r>
     </w:p>
     <w:p>
@@ -2142,13 +2149,54 @@
           <w:rFonts w:ascii="SimSun" w:hAnsi="SimSun" w:eastAsia="SimSun"/>
           <w:sz w:val="21"/>
         </w:rPr>
-        <w:t>本次课程实验成绩反映出整体表现优异。全班共有47名学生参与，成绩从最低的0分到最高的99分，平均分为90.16分。成绩分布呈现明显的集中趋势，大部分学生得分集中在高分段。</w:t>
+        <w:t>### 课程实验成绩分析报告</w:t>
         <w:br/>
         <w:br/>
-        <w:t>具体来看，仅有1名学生获得0至10分，占比仅为2.13%，这部分学生可能需要额外的帮助和指导来提升成绩。而80至90分之间有10名学生，占比21.28%，这些学生已经表现出较高的水平。更令人欣慰的是，高达76.60%的学生，即36人，获得了90分以上的高分，显示出绝大多数学生对课程内容掌握良好，能够完成实验任务并取得优异成绩。</w:t>
+        <w:t>本报告旨在对某课程实验成绩进行全面分析，以期为后续教学改进提供依据。该课程共有47名学生参与实验，成绩范围从0分到99.0分，平均成绩为90.16分。</w:t>
         <w:br/>
         <w:br/>
-        <w:t>总体而言，本次实验成绩反映了学生们对于课程内容的理解与应用能力较强，大部分学生能够顺利完成实验并达到较高标准。对于少数成绩较低的学生，建议提供针对性辅导和支持，帮助他们提高成绩。同时，也可以考虑在后续课程中加入更多实践环节，进一步巩固学生们的知识和技能。</w:t>
+        <w:t>#### 成绩分布情况</w:t>
+        <w:br/>
+        <w:br/>
+        <w:t>- **0-10分**：1人，占比2.13%</w:t>
+        <w:br/>
+        <w:t>- **80-90分**：10人，占比21.28%</w:t>
+        <w:br/>
+        <w:t>- **90-100分**：36人，占比76.60%</w:t>
+        <w:br/>
+        <w:br/>
+        <w:t>由上述数据可见，大部分学生（约76.60%）取得了优异的成绩，而仅有少数学生（约2.13%）成绩较低。成绩集中在高分段，表明大多数学生对课程内容掌握较好。</w:t>
+        <w:br/>
+        <w:br/>
+        <w:t>#### 分析与建议</w:t>
+        <w:br/>
+        <w:br/>
+        <w:t>1. **成绩分布特点**</w:t>
+        <w:br/>
+        <w:t xml:space="preserve">   - 高分段学生占绝大多数，反映出课程设计能够有效激发学生学习兴趣，帮助学生掌握核心知识点。</w:t>
+        <w:br/>
+        <w:t xml:space="preserve">   - 低分段学生数量较少，但需关注这部分学生的学习情况，了解其存在的问题并给予必要指导。</w:t>
+        <w:br/>
+        <w:br/>
+        <w:t>2. **成绩差异原因探讨**</w:t>
+        <w:br/>
+        <w:t xml:space="preserve">   - 可能因素包括但不限于：学生个体差异（如学习习惯、时间管理能力等）、对知识的理解深度不同以及实验题目的难易程度。</w:t>
+        <w:br/>
+        <w:t xml:space="preserve">   - 值得一提的是，尽管整体成绩较高，但存在个别学生成绩显著偏低的现象，需要进一步调查具体原因。</w:t>
+        <w:br/>
+        <w:br/>
+        <w:t>3. **改进建议**</w:t>
+        <w:br/>
+        <w:t xml:space="preserve">   - 加强基础理论教学，确保所有学生都能打下坚实的基础。</w:t>
+        <w:br/>
+        <w:t xml:space="preserve">   - 提供多样化的学习资源和支持服务，如在线辅导、小组讨论等，帮助成绩偏低的学生提高成绩。</w:t>
+        <w:br/>
+        <w:t xml:space="preserve">   - 设计更具挑战性的实验题目，既保证优秀学生的能力得到充分发挥，也能通过适当难度的设置促进中等和低分学生进步。</w:t>
+        <w:br/>
+        <w:t xml:space="preserve">   - 定期进行课堂反馈，及时调整教学策略，确保每位学生都能跟上课程进度。</w:t>
+        <w:br/>
+        <w:br/>
+        <w:t>综上所述，虽然该课程整体表现良好，但仍需针对不同层次的学生采取差异化教学策略，以实现更全面的教学效果提升。</w:t>
       </w:r>
     </w:p>
     <w:p>
@@ -2205,7 +2253,7 @@
         </w:rPr>
         <w:t>从试题内容来看，试卷基本能覆盖教学大纲中的实践操作内容，能较好地考察学生的掌握情况，也能较真实地反映学生的计算机应用水平。</w:t>
         <w:br/>
-        <w:t>1班的期末考试成绩情况见表4。</w:t>
+        <w:t>g和d班的期末考试成绩情况见表4。</w:t>
       </w:r>
     </w:p>
     <w:p>
@@ -3040,16 +3088,34 @@
           <w:rFonts w:ascii="SimSun" w:hAnsi="SimSun" w:eastAsia="SimSun"/>
           <w:sz w:val="21"/>
         </w:rPr>
-        <w:t>本次课程共有47名学生参与，整体来看，学生们的平均成绩为70.04分，最高分达到95.4分，最低分为0分。</w:t>
+        <w:t>**课程成绩总结与分析**</w:t>
         <w:br/>
         <w:br/>
-        <w:t>从成绩分布看，大部分学生集中在60至80分之间。具体来说，60至70分段的学生最多，占比约27.66%，其次是80至90分段，占比约19.15%。此外，90至100分段的学生也有7人，占比约14.89%，显示出一部分学生对课程内容掌握较好，能够取得高分。</w:t>
+        <w:t>本报告旨在基于期末考试成绩对课程的教学效果进行全面评估。本次课程共47名学生参与，最高分95.4分，最低分0分，平均分为70.04分。根据成绩分布情况，可以得出以下结论。</w:t>
         <w:br/>
         <w:br/>
-        <w:t>值得注意的是，有1名学生得分在0至10分之间，另有1名学生得分在30至40分之间。这表明有少数学生可能对课程内容理解不足或参与度不高，需要进一步关注和支持。</w:t>
+        <w:t>从各分数段的人数分布来看，0-10分区间内有1位学生，占比2.13%；30-40分区间内有1位学生，占比2.13%；40-50分区间内有3位学生，占比6.38%；50-60分区间内有7位学生，占比14.89%；60-70分区间内有13位学生，占比27.66%；70-80分区间内有6位学生，占比12.77%；80-90分区间内有9位学生，占比19.15%；90-100分区间内有7位学生，占比14.89%。其中，60-70分区间内的学生人数最多，占总人数的27.66%，而0-10分区间的学生最少，仅有1人。</w:t>
         <w:br/>
         <w:br/>
-        <w:t>总体而言，大多数学生表现良好，但也有改进的空间。为了帮助所有学生更好地掌握课程内容，建议未来教学中加强基础知识讲解，同时增加互动环节，激发学生学习兴趣，提高整体学习效果。针对成绩偏低的学生，可以考虑提供额外辅导资源，确保每位学生都能跟上课程进度，充分受益于本课程的教学目标。</w:t>
+        <w:t>成绩分布表明，部分学生成绩较为理想，但仍有相当一部分学生未能达到预期的学习目标。具体而言，约有21.28%的学生（即10位）成绩低于60分，这部分学生可能需要更多的关注和支持以提高他们的学习效果。同时，有近一半的学生（48.91%）成绩位于60-80分之间，表明这些学生达到了基本要求，但仍存在较大的提升空间。</w:t>
+        <w:br/>
+        <w:br/>
+        <w:t>针对以上情况，建议采取以下措施以改善教学效果：</w:t>
+        <w:br/>
+        <w:br/>
+        <w:t>1. **加强基础知识教学**：对于成绩较低的学生，应重点强化基础知识的教学，帮助他们打下坚实的基础，从而更好地理解和掌握后续的知识点。</w:t>
+        <w:br/>
+        <w:t xml:space="preserve">   </w:t>
+        <w:br/>
+        <w:t>2. **个性化辅导**：结合每位学生的学习特点和薄弱环节，提供个性化的辅导方案，帮助他们在学习过程中遇到的问题得到及时解决。</w:t>
+        <w:br/>
+        <w:t xml:space="preserve">   </w:t>
+        <w:br/>
+        <w:t>3. **增加互动性教学活动**：通过设计更多互动性强的教学活动，激发学生的学习兴趣，增强他们的课堂参与度，从而提高学习效果。</w:t>
+        <w:br/>
+        <w:t xml:space="preserve">   </w:t>
+        <w:br/>
+        <w:t>4. **加强反馈机制**：建立有效的反馈机制，</w:t>
       </w:r>
     </w:p>
     <w:p>
@@ -3074,7 +3140,7 @@
           <w:rFonts w:ascii="SimSun" w:hAnsi="SimSun" w:eastAsia="SimSun"/>
           <w:sz w:val="21"/>
         </w:rPr>
-        <w:t>1班的课程总评成绩情况见表5。</w:t>
+        <w:t>g和d班的课程总评成绩情况见表5。</w:t>
       </w:r>
     </w:p>
     <w:p>
@@ -3909,16 +3975,31 @@
           <w:rFonts w:ascii="SimSun" w:hAnsi="SimSun" w:eastAsia="SimSun"/>
           <w:sz w:val="21"/>
         </w:rPr>
-        <w:t>本课程共有47名学生参与。从整体成绩来看，平均分达到75.64分，显示出学生们对课程内容有较好的掌握。最高分为96.0分，最低分为0.0分，表明成绩差异较大。</w:t>
+        <w:t>本报告旨在对某课程的学生总评成绩进行全面分析，并基于此提出改进建议。</w:t>
         <w:br/>
         <w:br/>
-        <w:t>具体来看，低分段（0-50分）的学生较少，仅占总人数的6.38%，其中0-10分段有1人，40-50分段有2人。这说明大部分学生能够较好地完成课程要求，但也有一小部分学生在学习过程中遇到较大困难。</w:t>
+        <w:t>本次课程共有47名学生参与，成绩范围从0至96分，平均分为75.64分。成绩分布显示了学生整体表现的广泛差异，其中最高分与最低分之间的差距显著，表明了学生在理解和掌握课程内容方面的不同水平。</w:t>
         <w:br/>
         <w:br/>
-        <w:t>中高分段（50-100分）的学生占比达到了93.62%，其中50-60分段有1人，60-70分段有5人，70-80分段有18人，80-90分段有10人，90-100分段也有10人。特别是70-100分段的学生占据了相当大的比例，说明大多数学生在课程学习中表现出色，能够很好地理解和应用所学知识。</w:t>
+        <w:t>具体来看，成绩低于40分的学生仅有两名，占总人数的4.26%，而超过80分的学生共有20人，占比达到42.55%，显示出相当一部分学生能够较好地掌握课程内容。特别是有10名学生获得了90分以上的高分，说明这部分学生不仅掌握了课程的基本要求，还在某些方面表现出了卓越的能力。</w:t>
         <w:br/>
         <w:br/>
-        <w:t>总体而言，该课程学生表现良好，大部分学生取得了不错的成绩。但同时也反映出一部分学生在学习过程中遇到了挑战，需要在今后的教学中加强对这些学生的关注和支持，帮助他们提升学习成绩。此外，对于成绩较高的学生，可以考虑提供更多进阶的学习资源或挑战性任务，以激发他们的学习兴趣和潜能。</w:t>
+        <w:t>然而，成绩在40至60分之间的学生相对较少，仅占总人数的6.38%，这可能反映了学生在学习过程中遇到了一些挑战。尤其值得注意的是，最低分仅为0分，提示教师需要关注这部分学生成绩背后的原因，以便提供必要的支持。</w:t>
+        <w:br/>
+        <w:br/>
+        <w:t>根据上述分析，建议采取以下措施以提升整体教学质量：</w:t>
+        <w:br/>
+        <w:br/>
+        <w:t>1. **加强基础概念的教学**：针对成绩较低的学生群体，强化基础知识的教学和巩固，确保每位学生都能打下坚实的基础。</w:t>
+        <w:br/>
+        <w:t>2. **个性化辅导**：对于成绩存在显著差异的学生，提供个性化的辅导和支持，帮助他们克服学习中的障碍。</w:t>
+        <w:br/>
+        <w:t>3. **增加互动环节**：通过课堂讨论、小组合作等方式增加学生之间的互动，激发学生的学习兴趣，提高学习效率。</w:t>
+        <w:br/>
+        <w:t>4. **定期反馈与评估**：建立更为频繁的评估机制，及时给予学生反馈，帮助他们了解自己的学习进度及存在的问题，从而调整学习策略。</w:t>
+        <w:br/>
+        <w:br/>
+        <w:t>通过实施上述措施，预期可以进一步提升学生对课程内容的理解和掌握程度，促进全体学生的全面发展。</w:t>
       </w:r>
     </w:p>
     <w:p>
@@ -3955,22 +4036,40 @@
           <w:rFonts w:ascii="SimSun" w:hAnsi="SimSun" w:eastAsia="SimSun"/>
           <w:sz w:val="21"/>
         </w:rPr>
-        <w:t>在分析本课程的教学效果时，可以从以下几个方面进行考量：</w:t>
+        <w:t xml:space="preserve"> 教学效果综合分析报告</w:t>
         <w:br/>
         <w:br/>
-        <w:t>1、学生的基础知识掌握情况：大多数学生在课程开始前已经具备了一定的专业基础知识，这为新课程的学习打下了良好的基础。然而，部分学生可能因为先前学习的内容不够扎实，导致在理解新知识时遇到一些困难。总体而言，学生的基础知识水平参差不齐，需要教师在授课过程中给予不同程度的关注和支持。</w:t>
+        <w:t xml:space="preserve"> 1. 学生课程基础的掌握情况</w:t>
         <w:br/>
         <w:br/>
-        <w:t>2、学生的学习态度：学生们在学习过程中表现出了较高的积极性和参与度，尤其是在课堂讨论环节中，许多同学能够主动提出问题并积极参与交流，显示出较强的学习热情和探索精神。但是，也有少数学生在课堂上显得较为被动，需要教师通过多种方式激发他们的学习兴趣和动力。</w:t>
+        <w:t>在学习本课程前，学生对于相关基础知识的掌握程度显示了一定的差异性。基础相对扎实的学生能够快速理解和吸收新知识，而部分学生则需要更多的时间和指导来巩固其原有的知识体系。这种差异在一定程度上影响了课程初期的教学进度和深度，表明在未来的教学设计中，有必要针对不同水平的学生提供更加个性化的辅导方案。</w:t>
         <w:br/>
         <w:br/>
-        <w:t>3、课时安排对教学效果的影响：合理的课时分配有助于提高教学效率和学生的学习体验。当前的课时安排基本能够满足教学需求，但也存在某些章节内容较为密集的情况，可能导致学生感到压力较大。因此，适时调整课时分配，确保重点内容得到充分讲解的同时，留出足够的复习时间，对于提升整体教学效果至关重要。</w:t>
+        <w:t xml:space="preserve"> 2. 学生的学习态度情况</w:t>
         <w:br/>
         <w:br/>
-        <w:t>4、教学方式对教学效果的影响：采用多元化的教学方法，如案例分析、小组讨论、实践操作等，不仅能够增加课堂的互动性和趣味性，还能有效促进学生对知识的理解与应用。灵活运用不同的教学手段，根据学生的学习特点和需求调整教学策略，是提高教学质量的关键。</w:t>
+        <w:t>通过对学生提问情况及课堂参与度的观察，可以发现大部分学生表现出较高的学习积极性和主动性。他们不仅积极回答问题，还乐于分享自己的见解，这为营造积极向上的学习氛围奠定了良好基础。然而，仍有一小部分学生显得不够主动，可能需要更多的鼓励和支持来激发其学习兴趣。</w:t>
         <w:br/>
         <w:br/>
-        <w:t>5、教学内容对教学效果的影响：精心设计的教学内容不仅需要涵盖必要的理论知识，还应注重实际应用能力的培养。当前的教学大纲覆盖了广泛的知识点，并且强调了理论与实践相结合的重要性。不过，随着科技的发展和社会需求的变化，定期更新和优化教学内容，以保持其前沿性和实用性，是保证教学效果持续提升的重要因素。</w:t>
+        <w:t xml:space="preserve"> 3. 课时安排对教学效果的影响</w:t>
+        <w:br/>
+        <w:br/>
+        <w:t>当前的课时安排基本满足了课程内容的教授需求，但在某些关键知识点的讲解上仍有压缩空间。合理调整课时分配，确保每个重要概念都能得到充分的讨论与练习，将是提高教学效果的关键。此外，适当增加课外辅导时间，帮助学生消化和理解课堂内容，也是值得考虑的优化方向。</w:t>
+        <w:br/>
+        <w:br/>
+        <w:t xml:space="preserve"> 4. 教学方式对教学效果的影响</w:t>
+        <w:br/>
+        <w:br/>
+        <w:t>采用多样化的教学方法，如案例分析、小组讨论等互动性强的方式，显著提升了学生的学习兴趣和参与度。然而，在某些理论性较强的部分，传统的讲授式教学仍然发挥着不可或缺的作用。未来可考虑进一步融合线上与线下资源，利用多媒体技术丰富教学手段，以适应不同学习风格的学生。</w:t>
+        <w:br/>
+        <w:br/>
+        <w:t xml:space="preserve"> 5. 教学内容对教学效果的影响</w:t>
+        <w:br/>
+        <w:br/>
+        <w:t>总体而言，所选教学内容紧密贴合实际应用需求，有助于培养学生的实践能力和创新思维。但部分内容更新速度较慢，难以完全反映行业最新动态，这可能限制了学生对前沿知识的接触。建议定期更新教材和案例库，引入更多前沿研究成果，以保持课程内容的时效性和先进性。</w:t>
+        <w:br/>
+        <w:br/>
+        <w:t>综上所述，通过针对性地调整和优化上述几个方面，有望进一步提升教学质量和学生的学习成果。</w:t>
       </w:r>
     </w:p>
     <w:p>
@@ -3995,34 +4094,43 @@
           <w:rFonts w:ascii="SimSun" w:hAnsi="SimSun" w:eastAsia="SimSun"/>
           <w:sz w:val="21"/>
         </w:rPr>
-        <w:t>对于课程的改进与优化，可以从以下几个宏观层面出发：</w:t>
+        <w:t>课程效果与教学目标一致性分析报告</w:t>
         <w:br/>
         <w:br/>
-        <w:t>1. 增强互动性：增加课程内的互动环节，比如通过在线讨论、小组项目或实时问答等形式，提升学生参与度，促进知识的理解与吸收。</w:t>
+        <w:t>本报告旨在深入分析某课程的教学目标与实际教学效果之间的一致性，并基于数据分析提出改进建议。通过综合考量课程的内容设计、教学方法、学生反馈及学习成果等多方面因素，本报告力求为提升课程质量提供科学依据。</w:t>
         <w:br/>
         <w:br/>
-        <w:t>2. 丰富学习资源：提供多样化的学习资料，如视频讲座、案例研究、阅读材料等，以满足不同学习风格的学生需求。同时，确保这些资源是最新且高质量的。</w:t>
+        <w:t>1. 教学内容与目标一致性</w:t>
         <w:br/>
         <w:br/>
-        <w:t>3. 灵活的学习路径：设计可定制的学习路径，允许学生根据自己的兴趣和职业目标选择不同的模块或主题深入学习，提高课程的个性化程度。</w:t>
+        <w:t xml:space="preserve">   分析表明，课程内容在很大程度上符合其设定的教学目标，但在某些领域仍有提升空间。例如，在培养学生的批判性思维能力和应用知识解决实际问题的能力方面，课程内容略显不足。建议增加更多实践案例和讨论环节，以增强学生的实际操作能力和问题解决能力。</w:t>
         <w:br/>
         <w:br/>
-        <w:t>4. 强化实践应用：加强理论与实际应用之间的联系，通过项目作业、模拟演练等方式，让学生能够将所学知识应用于解决真实世界的问题中。</w:t>
+        <w:t>2. 教学方法与互动性</w:t>
         <w:br/>
         <w:br/>
-        <w:t>5. 持续反馈机制：建立有效的反馈系统，鼓励学生对课程内容、教学方法等方面提出意见和建议，并及时做出调整，以持续改进课程质量。</w:t>
+        <w:t xml:space="preserve">   当前的教学方法侧重于理论讲解，虽然能够有效地传递核心概念，但可能限制了学生深层次理解和创造性思考的发展。建议引入更多互动式学习活动，如小组讨论、项目合作等，以促进学生之间的交流与合作，同时激发他们的创新思维。</w:t>
         <w:br/>
         <w:br/>
-        <w:t>6. 技术支持与辅助：利用先进的教育技术手段，如人工智能辅导系统、虚拟实验室等，为学生提供个性化的学习支持和指导，提高学习效率。</w:t>
+        <w:t>3. 学生参与度与满意度</w:t>
         <w:br/>
         <w:br/>
-        <w:t>7. 培养批判性思维：在课程设计中融入批判性思考训练，引导学生学会质疑、分析和评价信息，培养独立解决问题的能力。</w:t>
+        <w:t xml:space="preserve">   数据显示，尽管大部分学生对课程内容表示满意，但部分学生反映缺乏足够的个性化支持和指导。建议建立更加灵活的学习路径，根据不同学生的需求提供定制化的学习资源和支持服务；同时加强师生之间的沟通，及时了解并解决学生在学习过程中遇到的问题。</w:t>
         <w:br/>
         <w:br/>
-        <w:t>8. 国际化视野：引入跨文化视角，邀请国际知名专家进行讲座或合作开发课程内容，拓宽学生的全球视野，增强其在全球化背景下的竞争力。</w:t>
+        <w:t>4. 评价体系与反馈机制</w:t>
         <w:br/>
         <w:br/>
-        <w:t>通过上述措施，不仅能够提升课程的整体质量，还能更好地激发学生的学习热情，促进其全面发展。</w:t>
+        <w:t xml:space="preserve">   现有的评价体系主要依赖于考试成绩来衡量学生的学习成效，而忽视了对学生过程性表现和个人成长的关注。建议构建多元化的评价体系，不仅包括期末考试成绩，也应考虑平时作业、课堂参与度、小组项目完成情况等因素，全面评估学生的学习成果。同时，实施定期反馈机制，确保每位学生都能获得关于自己学习进展的及时信息，以便调整学习策略。</w:t>
+        <w:br/>
+        <w:br/>
+        <w:t>5. 技术工具的应用</w:t>
+        <w:br/>
+        <w:br/>
+        <w:t xml:space="preserve">   在线教育平台和技术工具的应用对于提高教学效率和学生参与度至关重要。然而，目前课程中技术工具的使用尚不充分。建议加大技术工具的投入力度，利用在线协作平台、虚拟实验室等资源丰富教学手段，提升课程的吸引力和实用性。</w:t>
+        <w:br/>
+        <w:br/>
+        <w:t>综上所述，通过对课程各方面进行系统性的审视与分析，我们提出了若干有针对性的改进建议。期望通过这些措施的实施，能够在保持现有优势的基础上进一步优化课程结构，增强其实效性和吸引力，从而更好地达成既定的教学目标。</w:t>
       </w:r>
     </w:p>
     <w:sectPr>

</xml_diff>